<commit_message>
Update vendor sign-in sheet for 8/6 market, archive 7/30 sheet
</commit_message>
<xml_diff>
--- a/vendor-market/vendor_sign_in_sheet.docx
+++ b/vendor-market/vendor_sign_in_sheet.docx
@@ -61,7 +61,7 @@
                 <w:sz w:val="19"/>
                 <w:szCs w:val="19"/>
               </w:rPr>
-              <w:t>Backyard Brew is not responsible for weather-related cancellations, or for any damage to or theft of vendor property during the event. In the event of bad weather, it's up to each vendor to decide whether to stay and wait out the storm or leave. By checking in on 7/30, you're acknowledging these terms and the risks involved.</w:t>
+              <w:t>Backyard Brew is not responsible for weather-related cancellations, or for any damage to or theft of vendor property during the event. In the event of bad weather, it's up to each vendor to decide whether to stay and wait out the storm or leave. By checking in on 8/6, you're acknowledging these terms and the risks involved.</w:t>
             </w:r>
           </w:p>
         </w:tc>
@@ -226,7 +226,7 @@
           </w:tcPr>
           <w:p>
             <w:r>
-              <w:t>Brittany Ahrens</w:t>
+              <w:t>Barbara Roettgen</w:t>
             </w:r>
           </w:p>
         </w:tc>
@@ -243,7 +243,7 @@
           </w:tcPr>
           <w:p>
             <w:r>
-              <w:t>Twisted Painters</w:t>
+              <w:t>Boxes and More by Barb</w:t>
             </w:r>
           </w:p>
         </w:tc>
@@ -258,7 +258,9 @@
             </w:tcMar>
             <w:vAlign w:val="center"/>
           </w:tcPr>
-          <w:p/>
+          <w:p>
+            <w:r/>
+          </w:p>
         </w:tc>
         <w:tc>
           <w:tcPr>
@@ -271,7 +273,9 @@
             </w:tcMar>
             <w:vAlign w:val="center"/>
           </w:tcPr>
-          <w:p/>
+          <w:p>
+            <w:r/>
+          </w:p>
         </w:tc>
       </w:tr>
       <w:tr>
@@ -289,7 +293,7 @@
           </w:tcPr>
           <w:p>
             <w:r>
-              <w:t>Lori Stiles Joachim</w:t>
+              <w:t>Lydia Morrone</w:t>
             </w:r>
           </w:p>
         </w:tc>
@@ -307,7 +311,7 @@
           </w:tcPr>
           <w:p>
             <w:r>
-              <w:t>Jojo's Sew Sweet</w:t>
+              <w:t>Scrunched</w:t>
             </w:r>
           </w:p>
         </w:tc>
@@ -323,7 +327,9 @@
             </w:tcMar>
             <w:vAlign w:val="center"/>
           </w:tcPr>
-          <w:p/>
+          <w:p>
+            <w:r/>
+          </w:p>
         </w:tc>
         <w:tc>
           <w:tcPr>
@@ -337,7 +343,9 @@
             </w:tcMar>
             <w:vAlign w:val="center"/>
           </w:tcPr>
-          <w:p/>
+          <w:p>
+            <w:r/>
+          </w:p>
         </w:tc>
       </w:tr>
       <w:tr>
@@ -354,7 +362,7 @@
           </w:tcPr>
           <w:p>
             <w:r>
-              <w:t>Jackie Lynn Paske</w:t>
+              <w:t>Lori Molina Stromberg</w:t>
             </w:r>
           </w:p>
         </w:tc>
@@ -371,7 +379,7 @@
           </w:tcPr>
           <w:p>
             <w:r>
-              <w:t>Crafty Jax Magnets &amp; More</w:t>
+              <w:t>Custom Painted Signs by Lori</w:t>
             </w:r>
           </w:p>
         </w:tc>
@@ -386,7 +394,9 @@
             </w:tcMar>
             <w:vAlign w:val="center"/>
           </w:tcPr>
-          <w:p/>
+          <w:p>
+            <w:r/>
+          </w:p>
         </w:tc>
         <w:tc>
           <w:tcPr>
@@ -399,7 +409,9 @@
             </w:tcMar>
             <w:vAlign w:val="center"/>
           </w:tcPr>
-          <w:p/>
+          <w:p>
+            <w:r/>
+          </w:p>
         </w:tc>
       </w:tr>
       <w:tr>
@@ -417,7 +429,7 @@
           </w:tcPr>
           <w:p>
             <w:r>
-              <w:t>Jamie Anne</w:t>
+              <w:t>Emma Stamm</w:t>
             </w:r>
           </w:p>
         </w:tc>
@@ -435,7 +447,7 @@
           </w:tcPr>
           <w:p>
             <w:r>
-              <w:t>Knot Heads</w:t>
+              <w:t>Icing &amp; Ink Desserts</w:t>
             </w:r>
           </w:p>
         </w:tc>
@@ -451,7 +463,9 @@
             </w:tcMar>
             <w:vAlign w:val="center"/>
           </w:tcPr>
-          <w:p/>
+          <w:p>
+            <w:r/>
+          </w:p>
         </w:tc>
         <w:tc>
           <w:tcPr>
@@ -465,7 +479,9 @@
             </w:tcMar>
             <w:vAlign w:val="center"/>
           </w:tcPr>
-          <w:p/>
+          <w:p>
+            <w:r/>
+          </w:p>
         </w:tc>
       </w:tr>
       <w:tr>
@@ -482,7 +498,7 @@
           </w:tcPr>
           <w:p>
             <w:r>
-              <w:t>Lydia Morrone</w:t>
+              <w:t>Lilith Paper Co</w:t>
             </w:r>
           </w:p>
         </w:tc>
@@ -499,7 +515,7 @@
           </w:tcPr>
           <w:p>
             <w:r>
-              <w:t>Scrunched</w:t>
+              <w:t>Lilith Paper Co</w:t>
             </w:r>
           </w:p>
         </w:tc>
@@ -514,7 +530,9 @@
             </w:tcMar>
             <w:vAlign w:val="center"/>
           </w:tcPr>
-          <w:p/>
+          <w:p>
+            <w:r/>
+          </w:p>
         </w:tc>
         <w:tc>
           <w:tcPr>
@@ -527,7 +545,9 @@
             </w:tcMar>
             <w:vAlign w:val="center"/>
           </w:tcPr>
-          <w:p/>
+          <w:p>
+            <w:r/>
+          </w:p>
         </w:tc>
       </w:tr>
       <w:tr>
@@ -545,7 +565,7 @@
           </w:tcPr>
           <w:p>
             <w:r>
-              <w:t>Heather Phillips</w:t>
+              <w:t>Lisa Marie Stazak</w:t>
             </w:r>
           </w:p>
         </w:tc>
@@ -563,10 +583,8 @@
           </w:tcPr>
           <w:p>
             <w:r>
-              <w:t>Koozie Kids</w:t>
-            </w:r>
-            <w:r/>
-            <w:r/>
+              <w:t>Heart of Stone Rhinestoning</w:t>
+            </w:r>
           </w:p>
         </w:tc>
         <w:tc>
@@ -581,7 +599,9 @@
             </w:tcMar>
             <w:vAlign w:val="center"/>
           </w:tcPr>
-          <w:p/>
+          <w:p>
+            <w:r/>
+          </w:p>
         </w:tc>
         <w:tc>
           <w:tcPr>
@@ -595,7 +615,9 @@
             </w:tcMar>
             <w:vAlign w:val="center"/>
           </w:tcPr>
-          <w:p/>
+          <w:p>
+            <w:r/>
+          </w:p>
         </w:tc>
       </w:tr>
       <w:tr>
@@ -612,7 +634,7 @@
           </w:tcPr>
           <w:p>
             <w:r>
-              <w:t>Lori Molina Stromberg</w:t>
+              <w:t>Brianna Walton</w:t>
             </w:r>
           </w:p>
         </w:tc>
@@ -629,7 +651,7 @@
           </w:tcPr>
           <w:p>
             <w:r>
-              <w:t>Custom Painted Signs by Lori</w:t>
+              <w:t>Stressed Stitches</w:t>
             </w:r>
           </w:p>
         </w:tc>
@@ -644,7 +666,9 @@
             </w:tcMar>
             <w:vAlign w:val="center"/>
           </w:tcPr>
-          <w:p/>
+          <w:p>
+            <w:r/>
+          </w:p>
         </w:tc>
         <w:tc>
           <w:tcPr>
@@ -657,7 +681,9 @@
             </w:tcMar>
             <w:vAlign w:val="center"/>
           </w:tcPr>
-          <w:p/>
+          <w:p>
+            <w:r/>
+          </w:p>
         </w:tc>
       </w:tr>
       <w:tr>
@@ -675,7 +701,7 @@
           </w:tcPr>
           <w:p>
             <w:r>
-              <w:t>Morgan Saracena</w:t>
+              <w:t>Dee Peterman</w:t>
             </w:r>
           </w:p>
         </w:tc>
@@ -693,7 +719,7 @@
           </w:tcPr>
           <w:p>
             <w:r>
-              <w:t>Simply Hers Co</w:t>
+              <w:t>Color Street</w:t>
             </w:r>
           </w:p>
         </w:tc>
@@ -709,7 +735,9 @@
             </w:tcMar>
             <w:vAlign w:val="center"/>
           </w:tcPr>
-          <w:p/>
+          <w:p>
+            <w:r/>
+          </w:p>
         </w:tc>
         <w:tc>
           <w:tcPr>
@@ -723,7 +751,9 @@
             </w:tcMar>
             <w:vAlign w:val="center"/>
           </w:tcPr>
-          <w:p/>
+          <w:p>
+            <w:r/>
+          </w:p>
         </w:tc>
       </w:tr>
       <w:tr>
@@ -740,7 +770,7 @@
           </w:tcPr>
           <w:p>
             <w:r>
-              <w:t>Talen</w:t>
+              <w:t>Jaydah Truran</w:t>
             </w:r>
           </w:p>
         </w:tc>
@@ -757,7 +787,7 @@
           </w:tcPr>
           <w:p>
             <w:r>
-              <w:t>Dusty Rose</w:t>
+              <w:t>Rebel Ink</w:t>
             </w:r>
           </w:p>
         </w:tc>
@@ -772,7 +802,9 @@
             </w:tcMar>
             <w:vAlign w:val="center"/>
           </w:tcPr>
-          <w:p/>
+          <w:p>
+            <w:r/>
+          </w:p>
         </w:tc>
         <w:tc>
           <w:tcPr>
@@ -785,7 +817,9 @@
             </w:tcMar>
             <w:vAlign w:val="center"/>
           </w:tcPr>
-          <w:p/>
+          <w:p>
+            <w:r/>
+          </w:p>
         </w:tc>
       </w:tr>
       <w:tr>
@@ -803,7 +837,7 @@
           </w:tcPr>
           <w:p>
             <w:r>
-              <w:t>Sarah Crist</w:t>
+              <w:t>Ashley Paal</w:t>
             </w:r>
           </w:p>
         </w:tc>
@@ -821,7 +855,7 @@
           </w:tcPr>
           <w:p>
             <w:r>
-              <w:t>Cornerstone Mortgage</w:t>
+              <w:t>Bookish Gifts By Ash</w:t>
             </w:r>
           </w:p>
         </w:tc>
@@ -837,7 +871,9 @@
             </w:tcMar>
             <w:vAlign w:val="center"/>
           </w:tcPr>
-          <w:p/>
+          <w:p>
+            <w:r/>
+          </w:p>
         </w:tc>
         <w:tc>
           <w:tcPr>
@@ -851,7 +887,9 @@
             </w:tcMar>
             <w:vAlign w:val="center"/>
           </w:tcPr>
-          <w:p/>
+          <w:p>
+            <w:r/>
+          </w:p>
         </w:tc>
       </w:tr>
       <w:tr>
@@ -868,7 +906,7 @@
           </w:tcPr>
           <w:p>
             <w:r>
-              <w:t>Brenda Mikkelson Weddle</w:t>
+              <w:t>Alicia Meltesen</w:t>
             </w:r>
           </w:p>
         </w:tc>
@@ -884,11 +922,9 @@
             <w:vAlign w:val="center"/>
           </w:tcPr>
           <w:p>
-            <w:proofErr w:type="spellStart"/>
-            <w:r>
-              <w:t>A Wreath for All Seasons by Shirley</w:t>
-            </w:r>
-            <w:proofErr w:type="spellEnd"/>
+            <w:r>
+              <w:t>A&amp;B Creations</w:t>
+            </w:r>
           </w:p>
         </w:tc>
         <w:tc>
@@ -902,7 +938,9 @@
             </w:tcMar>
             <w:vAlign w:val="center"/>
           </w:tcPr>
-          <w:p/>
+          <w:p>
+            <w:r/>
+          </w:p>
         </w:tc>
         <w:tc>
           <w:tcPr>
@@ -915,7 +953,9 @@
             </w:tcMar>
             <w:vAlign w:val="center"/>
           </w:tcPr>
-          <w:p/>
+          <w:p>
+            <w:r/>
+          </w:p>
         </w:tc>
       </w:tr>
       <w:tr>
@@ -933,7 +973,7 @@
           </w:tcPr>
           <w:p>
             <w:r>
-              <w:t>Alicia Meltesen</w:t>
+              <w:t>Ashley Rubens</w:t>
             </w:r>
           </w:p>
         </w:tc>
@@ -950,9 +990,6 @@
             <w:vAlign w:val="center"/>
           </w:tcPr>
           <w:p>
-            <w:r>
-              <w:t>A &amp; B Creations</w:t>
-            </w:r>
             <w:r/>
           </w:p>
         </w:tc>
@@ -968,7 +1005,9 @@
             </w:tcMar>
             <w:vAlign w:val="center"/>
           </w:tcPr>
-          <w:p/>
+          <w:p>
+            <w:r/>
+          </w:p>
         </w:tc>
         <w:tc>
           <w:tcPr>
@@ -982,7 +1021,9 @@
             </w:tcMar>
             <w:vAlign w:val="center"/>
           </w:tcPr>
-          <w:p/>
+          <w:p>
+            <w:r/>
+          </w:p>
         </w:tc>
       </w:tr>
       <w:tr>
@@ -999,7 +1040,7 @@
           </w:tcPr>
           <w:p>
             <w:r>
-              <w:t>Jaydah Truran</w:t>
+              <w:t>Jackie Lynn Paske</w:t>
             </w:r>
           </w:p>
         </w:tc>
@@ -1016,7 +1057,7 @@
           </w:tcPr>
           <w:p>
             <w:r>
-              <w:t>Rebel Ink</w:t>
+              <w:t>Crafty Jax Magnets and More</w:t>
             </w:r>
           </w:p>
         </w:tc>
@@ -1031,7 +1072,9 @@
             </w:tcMar>
             <w:vAlign w:val="center"/>
           </w:tcPr>
-          <w:p/>
+          <w:p>
+            <w:r/>
+          </w:p>
         </w:tc>
         <w:tc>
           <w:tcPr>
@@ -1044,7 +1087,9 @@
             </w:tcMar>
             <w:vAlign w:val="center"/>
           </w:tcPr>
-          <w:p/>
+          <w:p>
+            <w:r/>
+          </w:p>
         </w:tc>
       </w:tr>
       <w:tr>
@@ -1061,9 +1106,7 @@
             <w:vAlign w:val="center"/>
           </w:tcPr>
           <w:p>
-            <w:r>
-              <w:t>Brenda Crump</w:t>
-            </w:r>
+            <w:r/>
           </w:p>
         </w:tc>
         <w:tc>
@@ -1079,12 +1122,6 @@
             <w:vAlign w:val="center"/>
           </w:tcPr>
           <w:p>
-            <w:r>
-              <w:t>CruzBrenBrenSeasoning</w:t>
-            </w:r>
-            <w:proofErr w:type="gramStart"/>
-            <w:r/>
-            <w:proofErr w:type="gramEnd"/>
             <w:r/>
           </w:p>
         </w:tc>
@@ -1100,7 +1137,9 @@
             </w:tcMar>
             <w:vAlign w:val="center"/>
           </w:tcPr>
-          <w:p/>
+          <w:p>
+            <w:r/>
+          </w:p>
         </w:tc>
         <w:tc>
           <w:tcPr>
@@ -1114,7 +1153,9 @@
             </w:tcMar>
             <w:vAlign w:val="center"/>
           </w:tcPr>
-          <w:p/>
+          <w:p>
+            <w:r/>
+          </w:p>
         </w:tc>
       </w:tr>
       <w:tr>
@@ -1130,9 +1171,6 @@
             <w:vAlign w:val="center"/>
           </w:tcPr>
           <w:p>
-            <w:r>
-              <w:t>Brad Langkau</w:t>
-            </w:r>
             <w:r/>
           </w:p>
         </w:tc>
@@ -1148,9 +1186,7 @@
             <w:vAlign w:val="center"/>
           </w:tcPr>
           <w:p>
-            <w:r>
-              <w:t>Nightmare Novelties</w:t>
-            </w:r>
+            <w:r/>
           </w:p>
         </w:tc>
         <w:tc>
@@ -1164,7 +1200,9 @@
             </w:tcMar>
             <w:vAlign w:val="center"/>
           </w:tcPr>
-          <w:p/>
+          <w:p>
+            <w:r/>
+          </w:p>
         </w:tc>
         <w:tc>
           <w:tcPr>
@@ -1177,7 +1215,9 @@
             </w:tcMar>
             <w:vAlign w:val="center"/>
           </w:tcPr>
-          <w:p/>
+          <w:p>
+            <w:r/>
+          </w:p>
         </w:tc>
       </w:tr>
       <w:tr>
@@ -1194,9 +1234,7 @@
             <w:vAlign w:val="center"/>
           </w:tcPr>
           <w:p>
-            <w:r>
-              <w:t>Kim Viduski</w:t>
-            </w:r>
+            <w:r/>
           </w:p>
         </w:tc>
         <w:tc>
@@ -1212,9 +1250,7 @@
             <w:vAlign w:val="center"/>
           </w:tcPr>
           <w:p>
-            <w:r>
-              <w:t>Ashwaubenon PAC</w:t>
-            </w:r>
+            <w:r/>
           </w:p>
         </w:tc>
         <w:tc>
@@ -1229,7 +1265,9 @@
             </w:tcMar>
             <w:vAlign w:val="center"/>
           </w:tcPr>
-          <w:p/>
+          <w:p>
+            <w:r/>
+          </w:p>
         </w:tc>
         <w:tc>
           <w:tcPr>
@@ -1243,7 +1281,9 @@
             </w:tcMar>
             <w:vAlign w:val="center"/>
           </w:tcPr>
-          <w:p/>
+          <w:p>
+            <w:r/>
+          </w:p>
         </w:tc>
       </w:tr>
       <w:tr>
@@ -1288,7 +1328,9 @@
             </w:tcMar>
             <w:vAlign w:val="center"/>
           </w:tcPr>
-          <w:p/>
+          <w:p>
+            <w:r/>
+          </w:p>
         </w:tc>
         <w:tc>
           <w:tcPr>
@@ -1301,7 +1343,9 @@
             </w:tcMar>
             <w:vAlign w:val="center"/>
           </w:tcPr>
-          <w:p/>
+          <w:p>
+            <w:r/>
+          </w:p>
         </w:tc>
       </w:tr>
       <w:tr>
@@ -1349,7 +1393,9 @@
             </w:tcMar>
             <w:vAlign w:val="center"/>
           </w:tcPr>
-          <w:p/>
+          <w:p>
+            <w:r/>
+          </w:p>
         </w:tc>
         <w:tc>
           <w:tcPr>
@@ -1363,7 +1409,9 @@
             </w:tcMar>
             <w:vAlign w:val="center"/>
           </w:tcPr>
-          <w:p/>
+          <w:p>
+            <w:r/>
+          </w:p>
         </w:tc>
       </w:tr>
       <w:tr>
@@ -1408,7 +1456,9 @@
             </w:tcMar>
             <w:vAlign w:val="center"/>
           </w:tcPr>
-          <w:p/>
+          <w:p>
+            <w:r/>
+          </w:p>
         </w:tc>
         <w:tc>
           <w:tcPr>
@@ -1421,7 +1471,9 @@
             </w:tcMar>
             <w:vAlign w:val="center"/>
           </w:tcPr>
-          <w:p/>
+          <w:p>
+            <w:r/>
+          </w:p>
         </w:tc>
       </w:tr>
       <w:tr>
@@ -1469,7 +1521,9 @@
             </w:tcMar>
             <w:vAlign w:val="center"/>
           </w:tcPr>
-          <w:p/>
+          <w:p>
+            <w:r/>
+          </w:p>
         </w:tc>
         <w:tc>
           <w:tcPr>
@@ -1483,7 +1537,9 @@
             </w:tcMar>
             <w:vAlign w:val="center"/>
           </w:tcPr>
-          <w:p/>
+          <w:p>
+            <w:r/>
+          </w:p>
         </w:tc>
       </w:tr>
       <w:tr>
@@ -1528,7 +1584,9 @@
             </w:tcMar>
             <w:vAlign w:val="center"/>
           </w:tcPr>
-          <w:p/>
+          <w:p>
+            <w:r/>
+          </w:p>
         </w:tc>
         <w:tc>
           <w:tcPr>
@@ -1541,7 +1599,9 @@
             </w:tcMar>
             <w:vAlign w:val="center"/>
           </w:tcPr>
-          <w:p/>
+          <w:p>
+            <w:r/>
+          </w:p>
         </w:tc>
       </w:tr>
     </w:tbl>

</xml_diff>

<commit_message>
Update vendor sign-in sheet, keep incident evidence folder private
</commit_message>
<xml_diff>
--- a/vendor-market/vendor_sign_in_sheet.docx
+++ b/vendor-market/vendor_sign_in_sheet.docx
@@ -61,7 +61,7 @@
                 <w:sz w:val="19"/>
                 <w:szCs w:val="19"/>
               </w:rPr>
-              <w:t>Backyard Brew is not responsible for weather-related cancellations, or for any damage to or theft of vendor property during the event. In the event of bad weather, it's up to each vendor to decide whether to stay and wait out the storm or leave. By checking in on 8/6, you're acknowledging these terms and the risks involved.</w:t>
+              <w:t>Backyard Brew is not responsible for weather-related cancellations, or for any damage to or theft of vendor property during the event. In the event of bad weather, it's up to each vendor to decide whether to stay and wait out the storm or leave. By checking in on 8/13, you're acknowledging these terms and the risks involved.</w:t>
             </w:r>
           </w:p>
         </w:tc>
@@ -255,7 +255,7 @@
           </w:tcPr>
           <w:p>
             <w:r>
-              <w:t>Barbara Roettgen</w:t>
+              <w:t>Jill Ziesemer</w:t>
             </w:r>
           </w:p>
         </w:tc>
@@ -272,7 +272,7 @@
           </w:tcPr>
           <w:p>
             <w:r>
-              <w:t>Boxes and More by Barb</w:t>
+              <w:t>Dear Soul Handmade</w:t>
             </w:r>
           </w:p>
         </w:tc>
@@ -438,7 +438,7 @@
           </w:tcPr>
           <w:p>
             <w:r>
-              <w:t>Lori Molina Stromberg</w:t>
+              <w:t>Rebecca Bex Hendricks</w:t>
             </w:r>
           </w:p>
         </w:tc>
@@ -455,7 +455,7 @@
           </w:tcPr>
           <w:p>
             <w:r>
-              <w:t>Custom Painted Signs by Lori</w:t>
+              <w:t>The Dainty Chain</w:t>
             </w:r>
           </w:p>
         </w:tc>
@@ -528,7 +528,7 @@
           </w:tcPr>
           <w:p>
             <w:r>
-              <w:t>Emma Stamm</w:t>
+              <w:t>Rebecca Bex Hendricks</w:t>
             </w:r>
           </w:p>
         </w:tc>
@@ -546,7 +546,7 @@
           </w:tcPr>
           <w:p>
             <w:r>
-              <w:t>Icing &amp; Ink Desserts</w:t>
+              <w:t>LittleLadiesLab</w:t>
             </w:r>
           </w:p>
         </w:tc>
@@ -621,7 +621,7 @@
           </w:tcPr>
           <w:p>
             <w:r>
-              <w:t>Lilith Paper Co</w:t>
+              <w:t>Alyssa Kuske</w:t>
             </w:r>
           </w:p>
         </w:tc>
@@ -638,7 +638,7 @@
           </w:tcPr>
           <w:p>
             <w:r>
-              <w:t>Lilith Paper Co</w:t>
+              <w:t>Calla Lily Clay</w:t>
             </w:r>
           </w:p>
         </w:tc>
@@ -711,7 +711,7 @@
           </w:tcPr>
           <w:p>
             <w:r>
-              <w:t>Lisa Marie Stazak</w:t>
+              <w:t>Kathy Deau Holzer</w:t>
             </w:r>
           </w:p>
         </w:tc>
@@ -729,7 +729,7 @@
           </w:tcPr>
           <w:p>
             <w:r>
-              <w:t>Heart of Stone Rhinestoning</w:t>
+              <w:t>Velvet antler</w:t>
             </w:r>
           </w:p>
         </w:tc>
@@ -804,7 +804,7 @@
           </w:tcPr>
           <w:p>
             <w:r>
-              <w:t>Brianna Walton</w:t>
+              <w:t>Jessica Anne</w:t>
             </w:r>
           </w:p>
         </w:tc>
@@ -821,7 +821,7 @@
           </w:tcPr>
           <w:p>
             <w:r>
-              <w:t>Stressed Stitches</w:t>
+              <w:t>Hooks &amp; Broomsticks</w:t>
             </w:r>
           </w:p>
         </w:tc>
@@ -894,7 +894,7 @@
           </w:tcPr>
           <w:p>
             <w:r>
-              <w:t>Dee Peterman</w:t>
+              <w:t>Jasmine Stiles</w:t>
             </w:r>
           </w:p>
         </w:tc>
@@ -912,7 +912,7 @@
           </w:tcPr>
           <w:p>
             <w:r>
-              <w:t>Color Street</w:t>
+              <w:t>Root and Remedy</w:t>
             </w:r>
           </w:p>
         </w:tc>
@@ -987,7 +987,7 @@
           </w:tcPr>
           <w:p>
             <w:r>
-              <w:t>Jaydah Truran</w:t>
+              <w:t>Riley Rolph</w:t>
             </w:r>
           </w:p>
         </w:tc>
@@ -1004,7 +1004,7 @@
           </w:tcPr>
           <w:p>
             <w:r>
-              <w:t>Rebel Ink</w:t>
+              <w:t>Fennec Creations</w:t>
             </w:r>
           </w:p>
         </w:tc>
@@ -1077,7 +1077,7 @@
           </w:tcPr>
           <w:p>
             <w:r>
-              <w:t>Ashley Paal</w:t>
+              <w:t>Spencer Jay</w:t>
             </w:r>
           </w:p>
         </w:tc>
@@ -1095,7 +1095,7 @@
           </w:tcPr>
           <w:p>
             <w:r>
-              <w:t>Bookish Gifts By Ash</w:t>
+              <w:t>Mongrels cursed creations</w:t>
             </w:r>
           </w:p>
         </w:tc>
@@ -1260,7 +1260,7 @@
           </w:tcPr>
           <w:p>
             <w:r>
-              <w:t>Ashley Rubens</w:t>
+              <w:t>Ketura Francois</w:t>
             </w:r>
           </w:p>
         </w:tc>
@@ -1277,7 +1277,9 @@
             <w:vAlign w:val="center"/>
           </w:tcPr>
           <w:p>
-            <w:r/>
+            <w:r>
+              <w:t>Ann Growth Hair</w:t>
+            </w:r>
           </w:p>
         </w:tc>
         <w:tc>
@@ -1350,9 +1352,7 @@
             <w:vAlign w:val="center"/>
           </w:tcPr>
           <w:p>
-            <w:r>
-              <w:t>Jackie Lynn Paske</w:t>
-            </w:r>
+            <w:r/>
           </w:p>
         </w:tc>
         <w:tc>
@@ -1367,9 +1367,7 @@
             <w:vAlign w:val="center"/>
           </w:tcPr>
           <w:p>
-            <w:r>
-              <w:t>Crafty Jax Magnets and More</w:t>
-            </w:r>
+            <w:r/>
           </w:p>
         </w:tc>
         <w:tc>

</xml_diff>

<commit_message>
Add Pickleball.html, karaoke/poker posters, event photos, and Sunday hours update
Co-Authored-By: Claude Sonnet 5 <noreply@anthropic.com>
</commit_message>
<xml_diff>
--- a/vendor-market/vendor_sign_in_sheet.docx
+++ b/vendor-market/vendor_sign_in_sheet.docx
@@ -61,7 +61,7 @@
                 <w:sz w:val="19"/>
                 <w:szCs w:val="19"/>
               </w:rPr>
-              <w:t>Backyard Brew is not responsible for weather-related cancellations, or for any damage to or theft of vendor property during the event. In the event of bad weather, it's up to each vendor to decide whether to stay and wait out the storm or leave. By checking in on 8/13, you're acknowledging these terms and the risks involved.</w:t>
+              <w:t>Backyard Brew is not responsible for weather-related cancellations, or for any damage to or theft of vendor property during the event. In the event of bad weather, it's up to each vendor to decide whether to stay and wait out the storm or leave. By checking in on 8/23, you're acknowledging these terms and the risks involved.</w:t>
             </w:r>
           </w:p>
         </w:tc>
@@ -345,7 +345,7 @@
           </w:tcPr>
           <w:p>
             <w:r>
-              <w:t>Lydia Morrone</w:t>
+              <w:t>Emma Stamm</w:t>
             </w:r>
           </w:p>
         </w:tc>
@@ -363,7 +363,7 @@
           </w:tcPr>
           <w:p>
             <w:r>
-              <w:t>Scrunched</w:t>
+              <w:t>Icing &amp; Ink Desserts</w:t>
             </w:r>
           </w:p>
         </w:tc>
@@ -438,7 +438,7 @@
           </w:tcPr>
           <w:p>
             <w:r>
-              <w:t>Rebecca Bex Hendricks</w:t>
+              <w:t>Chris Dewolfe</w:t>
             </w:r>
           </w:p>
         </w:tc>
@@ -455,7 +455,7 @@
           </w:tcPr>
           <w:p>
             <w:r>
-              <w:t>The Dainty Chain</w:t>
+              <w:t>Quackers Honey Farm</w:t>
             </w:r>
           </w:p>
         </w:tc>
@@ -528,7 +528,7 @@
           </w:tcPr>
           <w:p>
             <w:r>
-              <w:t>Rebecca Bex Hendricks</w:t>
+              <w:t>Olivia Jeanne Flora</w:t>
             </w:r>
           </w:p>
         </w:tc>
@@ -546,7 +546,7 @@
           </w:tcPr>
           <w:p>
             <w:r>
-              <w:t>LittleLadiesLab</w:t>
+              <w:t>Livvie-Linx Jewelry</w:t>
             </w:r>
           </w:p>
         </w:tc>
@@ -621,7 +621,7 @@
           </w:tcPr>
           <w:p>
             <w:r>
-              <w:t>Alyssa Kuske</w:t>
+              <w:t>Brittany Smith</w:t>
             </w:r>
           </w:p>
         </w:tc>
@@ -638,7 +638,7 @@
           </w:tcPr>
           <w:p>
             <w:r>
-              <w:t>Calla Lily Clay</w:t>
+              <w:t>Grace Mae Boutique</w:t>
             </w:r>
           </w:p>
         </w:tc>
@@ -711,7 +711,7 @@
           </w:tcPr>
           <w:p>
             <w:r>
-              <w:t>Kathy Deau Holzer</w:t>
+              <w:t>Blacksmith</w:t>
             </w:r>
           </w:p>
         </w:tc>
@@ -729,7 +729,7 @@
           </w:tcPr>
           <w:p>
             <w:r>
-              <w:t>Velvet antler</w:t>
+              <w:t>Blacksmithing</w:t>
             </w:r>
           </w:p>
         </w:tc>
@@ -804,7 +804,7 @@
           </w:tcPr>
           <w:p>
             <w:r>
-              <w:t>Jessica Anne</w:t>
+              <w:t>Jaydah Truran</w:t>
             </w:r>
           </w:p>
         </w:tc>
@@ -821,7 +821,7 @@
           </w:tcPr>
           <w:p>
             <w:r>
-              <w:t>Hooks &amp; Broomsticks</w:t>
+              <w:t>Rebel Ink</w:t>
             </w:r>
           </w:p>
         </w:tc>
@@ -894,7 +894,7 @@
           </w:tcPr>
           <w:p>
             <w:r>
-              <w:t>Jasmine Stiles</w:t>
+              <w:t>Michelle Jolynn</w:t>
             </w:r>
           </w:p>
         </w:tc>
@@ -912,7 +912,7 @@
           </w:tcPr>
           <w:p>
             <w:r>
-              <w:t>Root and Remedy</w:t>
+              <w:t>Michelle Prestine Podgin’ Parties and Mod Podge items</w:t>
             </w:r>
           </w:p>
         </w:tc>
@@ -987,7 +987,7 @@
           </w:tcPr>
           <w:p>
             <w:r>
-              <w:t>Riley Rolph</w:t>
+              <w:t>Alicia Meltesen</w:t>
             </w:r>
           </w:p>
         </w:tc>
@@ -1004,7 +1004,7 @@
           </w:tcPr>
           <w:p>
             <w:r>
-              <w:t>Fennec Creations</w:t>
+              <w:t>A&amp;B Creations</w:t>
             </w:r>
           </w:p>
         </w:tc>
@@ -1077,7 +1077,7 @@
           </w:tcPr>
           <w:p>
             <w:r>
-              <w:t>Spencer Jay</w:t>
+              <w:t>Grace Grulkowski</w:t>
             </w:r>
           </w:p>
         </w:tc>
@@ -1095,7 +1095,7 @@
           </w:tcPr>
           <w:p>
             <w:r>
-              <w:t>Mongrels cursed creations</w:t>
+              <w:t>Graceful Gluttony</w:t>
             </w:r>
           </w:p>
         </w:tc>
@@ -1170,7 +1170,7 @@
           </w:tcPr>
           <w:p>
             <w:r>
-              <w:t>Alicia Meltesen</w:t>
+              <w:t>Alex Brooks</w:t>
             </w:r>
           </w:p>
         </w:tc>
@@ -1187,7 +1187,7 @@
           </w:tcPr>
           <w:p>
             <w:r>
-              <w:t>A&amp;B Creations</w:t>
+              <w:t>Photography</w:t>
             </w:r>
           </w:p>
         </w:tc>
@@ -1259,9 +1259,7 @@
             <w:vAlign w:val="center"/>
           </w:tcPr>
           <w:p>
-            <w:r>
-              <w:t>Ketura Francois</w:t>
-            </w:r>
+            <w:r/>
           </w:p>
         </w:tc>
         <w:tc>
@@ -1277,9 +1275,7 @@
             <w:vAlign w:val="center"/>
           </w:tcPr>
           <w:p>
-            <w:r>
-              <w:t>Ann Growth Hair</w:t>
-            </w:r>
+            <w:r/>
           </w:p>
         </w:tc>
         <w:tc>

</xml_diff>